<commit_message>
Correct the commencement date and remove residual insider voice
The note said Division 296 'commenced on 1 July 2026'. The Act's own
commencement table puts Schedule 1 at 1 April 2026; 1 July 2026 is when it
begins to APPLY, to the 2026-27 income year. The opening sentence and the
Figure 4 timeline both carried the error and both are corrected, with the
timeline now distinguishing commencement from first application.

Also softens 'the ATO guidance is still unwritten' to the accurate 'law
companion ruling has not yet been published', renames the recommendations
section to 'Implications', and clears first-person phrasing that was
hardcoded in the figure driver rather than in the prose file.
</commit_message>
<xml_diff>
--- a/Division 296 - prudential research note.docx
+++ b/Division 296 - prudential research note.docx
@@ -139,7 +139,7 @@
     </w:p>
     <w:p>
       <w:pPr>
-        <w:spacing w:after="130" w:before="0" w:line="264"/>
+        <w:spacing w:after="95" w:before="0" w:line="264"/>
       </w:pPr>
       <w:r>
         <w:rPr>
@@ -218,7 +218,7 @@
                 <w:sz w:val="18"/>
                 <w:szCs w:val="18"/>
               </w:rPr>
-              <w:t xml:space="preserve">This is not a proposal. Division 296 has been law since March 2026 and commenced on 1 July 2026. The first measurement year is already running. The final regulations were registered twelve days before it began, and the ATO guidance explaining how to perform the calculation is still unwritten.</w:t>
+              <w:t xml:space="preserve">This is not a proposal. Division 296 received Royal Assent on 13 March 2026 and commenced on 1 April 2026. It applies from the 2026-27 income year, so the first measurement year has been running since 1 July 2026. The final regulations were registered on 18 June 2026, less than a fortnight before that year began, and the ATO's law companion ruling explaining how to perform the calculation has not yet been published.</w:t>
             </w:r>
           </w:p>
           <w:p>
@@ -283,7 +283,7 @@
     </w:tbl>
     <w:p>
       <w:pPr>
-        <w:spacing w:after="160" w:before="0" w:line="264"/>
+        <w:spacing w:after="115" w:before="0" w:line="264"/>
       </w:pPr>
       <w:r>
         <w:rPr>
@@ -2499,7 +2499,7 @@
       <w:r>
         <w:drawing>
           <wp:inline distT="0" distB="0" distL="0" distR="0">
-            <wp:extent cx="6143625" cy="2105025"/>
+            <wp:extent cx="6143625" cy="2095500"/>
             <wp:effectExtent t="0" r="0" b="0" l="0"/>
             <wp:docPr id="1" name="" descr="" title=""/>
             <wp:cNvGraphicFramePr>
@@ -2524,7 +2524,7 @@
                   <pic:spPr bwMode="auto">
                     <a:xfrm>
                       <a:off x="0" y="0"/>
-                      <a:ext cx="6143625" cy="2105025"/>
+                      <a:ext cx="6143625" cy="2095500"/>
                     </a:xfrm>
                     <a:prstGeom prst="rect">
                       <a:avLst/>
@@ -2570,7 +2570,7 @@
           <w:sz w:val="22"/>
           <w:szCs w:val="22"/>
         </w:rPr>
-        <w:t xml:space="preserve">What this implies for APRA</w:t>
+        <w:t xml:space="preserve">Implications</w:t>
       </w:r>
     </w:p>
     <w:p>

</xml_diff>